<commit_message>
Processed data assimilation leaving out varaibles Produced new plots
</commit_message>
<xml_diff>
--- a/MS/Seasonal_DA_MS_v1.docx
+++ b/MS/Seasonal_DA_MS_v1.docx
@@ -7446,7 +7446,7 @@
         </w:rPr>
         <w:lastRenderedPageBreak/>
         <w:drawing>
-          <wp:inline distT="0" distB="0" distL="0" distR="0" wp14:anchorId="5FC595C7" wp14:editId="72B5043F">
+          <wp:inline distT="0" distB="0" distL="0" distR="0" wp14:anchorId="5FC595C7" wp14:editId="0636E839">
             <wp:extent cx="5074930" cy="7239015"/>
             <wp:effectExtent l="0" t="0" r="0" b="0"/>
             <wp:docPr id="1465227967" name="Picture 1" descr="A diagram of a scientific experiment&#10;&#10;AI-generated content may be incorrect."/>
@@ -17621,9 +17621,9 @@
         </w:rPr>
         <w:lastRenderedPageBreak/>
         <w:drawing>
-          <wp:inline distT="0" distB="0" distL="0" distR="0" wp14:anchorId="275684C7" wp14:editId="561E3BC8">
-            <wp:extent cx="5671524" cy="4518867"/>
-            <wp:effectExtent l="0" t="0" r="5715" b="0"/>
+          <wp:inline distT="0" distB="0" distL="0" distR="0" wp14:anchorId="275684C7" wp14:editId="5A2B1F88">
+            <wp:extent cx="5685890" cy="4530315"/>
+            <wp:effectExtent l="0" t="0" r="0" b="3810"/>
             <wp:docPr id="429912538" name="Picture 1"/>
             <wp:cNvGraphicFramePr>
               <a:graphicFrameLocks xmlns:a="http://schemas.openxmlformats.org/drawingml/2006/main" noChangeAspect="1"/>
@@ -17650,7 +17650,7 @@
                   <pic:spPr>
                     <a:xfrm>
                       <a:off x="0" y="0"/>
-                      <a:ext cx="5685892" cy="4530315"/>
+                      <a:ext cx="5685890" cy="4530315"/>
                     </a:xfrm>
                     <a:prstGeom prst="rect">
                       <a:avLst/>
@@ -17746,9 +17746,9 @@
           <w:lang w:val="en-GB"/>
         </w:rPr>
         <w:drawing>
-          <wp:inline distT="0" distB="0" distL="0" distR="0" wp14:anchorId="06A7C36E" wp14:editId="4F796152">
-            <wp:extent cx="5731510" cy="2874465"/>
-            <wp:effectExtent l="0" t="0" r="2540" b="2540"/>
+          <wp:inline distT="0" distB="0" distL="0" distR="0" wp14:anchorId="06A7C36E" wp14:editId="61D86B3A">
+            <wp:extent cx="5731509" cy="2402283"/>
+            <wp:effectExtent l="0" t="0" r="3175" b="0"/>
             <wp:docPr id="1577997012" name="Picture 1"/>
             <wp:cNvGraphicFramePr>
               <a:graphicFrameLocks xmlns:a="http://schemas.openxmlformats.org/drawingml/2006/main" noChangeAspect="1"/>
@@ -17775,7 +17775,7 @@
                   <pic:spPr>
                     <a:xfrm>
                       <a:off x="0" y="0"/>
-                      <a:ext cx="5731510" cy="2874465"/>
+                      <a:ext cx="5731509" cy="2402283"/>
                     </a:xfrm>
                     <a:prstGeom prst="rect">
                       <a:avLst/>

</xml_diff>

<commit_message>
Finished sensitivity test for pre-normalization of climate variables
</commit_message>
<xml_diff>
--- a/MS/Seasonal_DA_MS_v1.docx
+++ b/MS/Seasonal_DA_MS_v1.docx
@@ -1522,7 +1522,23 @@
           <w:sz w:val="22"/>
           <w:szCs w:val="22"/>
         </w:rPr>
-        <w:t>(Brocas et al., 2016; Gagan et al., 1994; Watanabe et al., 2001)</w:t>
+        <w:t>(</w:t>
+      </w:r>
+      <w:proofErr w:type="spellStart"/>
+      <w:r>
+        <w:rPr>
+          <w:sz w:val="22"/>
+          <w:szCs w:val="22"/>
+        </w:rPr>
+        <w:t>Brocas</w:t>
+      </w:r>
+      <w:proofErr w:type="spellEnd"/>
+      <w:r>
+        <w:rPr>
+          <w:sz w:val="22"/>
+          <w:szCs w:val="22"/>
+        </w:rPr>
+        <w:t xml:space="preserve"> et al., 2016; Gagan et al., 1994; Watanabe et al., 2001)</w:t>
       </w:r>
       <w:r>
         <w:rPr>
@@ -17844,6 +17860,115 @@
           <w:szCs w:val="22"/>
           <w:lang w:val="en-GB"/>
         </w:rPr>
+        <w:t>Sensitivity to assembling different climate variables</w:t>
+      </w:r>
+      <w:r>
+        <w:rPr>
+          <w:sz w:val="22"/>
+          <w:szCs w:val="22"/>
+          <w:lang w:val="en-GB"/>
+        </w:rPr>
+        <w:t xml:space="preserve"> (exclude </w:t>
+      </w:r>
+      <w:proofErr w:type="spellStart"/>
+      <w:r>
+        <w:rPr>
+          <w:sz w:val="22"/>
+          <w:szCs w:val="22"/>
+          <w:lang w:val="en-GB"/>
+        </w:rPr>
+        <w:t>precip</w:t>
+      </w:r>
+      <w:proofErr w:type="spellEnd"/>
+      <w:r>
+        <w:rPr>
+          <w:sz w:val="22"/>
+          <w:szCs w:val="22"/>
+          <w:lang w:val="en-GB"/>
+        </w:rPr>
+        <w:t xml:space="preserve"> and SAT?)</w:t>
+      </w:r>
+    </w:p>
+    <w:p>
+      <w:pPr>
+        <w:jc w:val="both"/>
+        <w:rPr>
+          <w:sz w:val="22"/>
+          <w:szCs w:val="22"/>
+          <w:lang w:val="en-GB"/>
+        </w:rPr>
+      </w:pPr>
+      <w:r>
+        <w:rPr>
+          <w:noProof/>
+          <w:sz w:val="22"/>
+          <w:szCs w:val="22"/>
+          <w:lang w:val="en-GB"/>
+        </w:rPr>
+        <w:lastRenderedPageBreak/>
+        <w:drawing>
+          <wp:inline distT="0" distB="0" distL="0" distR="0" wp14:anchorId="27B38ACD" wp14:editId="3A7F93B5">
+            <wp:extent cx="5731510" cy="2402205"/>
+            <wp:effectExtent l="0" t="0" r="2540" b="0"/>
+            <wp:docPr id="1825044189" name="Picture 2"/>
+            <wp:cNvGraphicFramePr>
+              <a:graphicFrameLocks xmlns:a="http://schemas.openxmlformats.org/drawingml/2006/main" noChangeAspect="1"/>
+            </wp:cNvGraphicFramePr>
+            <a:graphic xmlns:a="http://schemas.openxmlformats.org/drawingml/2006/main">
+              <a:graphicData uri="http://schemas.openxmlformats.org/drawingml/2006/picture">
+                <pic:pic xmlns:pic="http://schemas.openxmlformats.org/drawingml/2006/picture">
+                  <pic:nvPicPr>
+                    <pic:cNvPr id="1825044189" name="Picture 1825044189"/>
+                    <pic:cNvPicPr/>
+                  </pic:nvPicPr>
+                  <pic:blipFill>
+                    <a:blip r:embed="rId18">
+                      <a:extLst>
+                        <a:ext uri="{28A0092B-C50C-407E-A947-70E740481C1C}">
+                          <a14:useLocalDpi xmlns:a14="http://schemas.microsoft.com/office/drawing/2010/main" val="0"/>
+                        </a:ext>
+                      </a:extLst>
+                    </a:blip>
+                    <a:stretch>
+                      <a:fillRect/>
+                    </a:stretch>
+                  </pic:blipFill>
+                  <pic:spPr>
+                    <a:xfrm>
+                      <a:off x="0" y="0"/>
+                      <a:ext cx="5731510" cy="2402205"/>
+                    </a:xfrm>
+                    <a:prstGeom prst="rect">
+                      <a:avLst/>
+                    </a:prstGeom>
+                  </pic:spPr>
+                </pic:pic>
+              </a:graphicData>
+            </a:graphic>
+          </wp:inline>
+        </w:drawing>
+      </w:r>
+    </w:p>
+    <w:p>
+      <w:pPr>
+        <w:pStyle w:val="ListParagraph"/>
+        <w:numPr>
+          <w:ilvl w:val="0"/>
+          <w:numId w:val="1"/>
+        </w:numPr>
+        <w:jc w:val="both"/>
+        <w:rPr>
+          <w:sz w:val="22"/>
+          <w:szCs w:val="22"/>
+          <w:lang w:val="en-GB"/>
+        </w:rPr>
+      </w:pPr>
+      <w:r>
+        <w:rPr>
+          <w:sz w:val="22"/>
+          <w:szCs w:val="22"/>
+          <w:lang w:val="en-GB"/>
+        </w:rPr>
         <w:t>Comparison different d18Oc-hydrology treatments (Harwood vs assuming -7 permille?)</w:t>
       </w:r>
     </w:p>
@@ -17867,7 +17992,6 @@
           <w:szCs w:val="22"/>
           <w:lang w:val="en-GB"/>
         </w:rPr>
-        <w:lastRenderedPageBreak/>
         <w:drawing>
           <wp:inline distT="0" distB="0" distL="0" distR="0" wp14:anchorId="7CC918F6" wp14:editId="6324FD55">
             <wp:extent cx="5731510" cy="2868652"/>
@@ -17884,7 +18008,7 @@
                     <pic:cNvPicPr/>
                   </pic:nvPicPr>
                   <pic:blipFill>
-                    <a:blip r:embed="rId18">
+                    <a:blip r:embed="rId19">
                       <a:extLst>
                         <a:ext uri="{28A0092B-C50C-407E-A947-70E740481C1C}">
                           <a14:useLocalDpi xmlns:a14="http://schemas.microsoft.com/office/drawing/2010/main" val="0"/>
@@ -17959,6 +18083,7 @@
           <w:szCs w:val="22"/>
           <w:lang w:val="en-GB"/>
         </w:rPr>
+        <w:lastRenderedPageBreak/>
         <w:drawing>
           <wp:inline distT="0" distB="0" distL="0" distR="0" wp14:anchorId="3671664E" wp14:editId="29757058">
             <wp:extent cx="5738411" cy="3057350"/>
@@ -17975,7 +18100,7 @@
                     <pic:cNvPicPr/>
                   </pic:nvPicPr>
                   <pic:blipFill>
-                    <a:blip r:embed="rId19">
+                    <a:blip r:embed="rId20">
                       <a:extLst>
                         <a:ext uri="{28A0092B-C50C-407E-A947-70E740481C1C}">
                           <a14:useLocalDpi xmlns:a14="http://schemas.microsoft.com/office/drawing/2010/main" val="0"/>
@@ -18157,7 +18282,6 @@
           <w:szCs w:val="22"/>
           <w:lang w:val="en-GB"/>
         </w:rPr>
-        <w:lastRenderedPageBreak/>
         <w:drawing>
           <wp:inline distT="0" distB="0" distL="0" distR="0" wp14:anchorId="2AC01B6C" wp14:editId="50CF3108">
             <wp:extent cx="5731508" cy="4566662"/>
@@ -18174,7 +18298,7 @@
                     <pic:cNvPicPr/>
                   </pic:nvPicPr>
                   <pic:blipFill>
-                    <a:blip r:embed="rId20">
+                    <a:blip r:embed="rId21">
                       <a:extLst>
                         <a:ext uri="{28A0092B-C50C-407E-A947-70E740481C1C}">
                           <a14:useLocalDpi xmlns:a14="http://schemas.microsoft.com/office/drawing/2010/main" val="0"/>
@@ -18275,28 +18399,6 @@
     </w:p>
     <w:p>
       <w:pPr>
-        <w:jc w:val="both"/>
-        <w:rPr>
-          <w:b/>
-          <w:bCs/>
-          <w:sz w:val="22"/>
-          <w:szCs w:val="22"/>
-          <w:lang w:val="en-GB"/>
-        </w:rPr>
-      </w:pPr>
-      <w:r>
-        <w:rPr>
-          <w:b/>
-          <w:bCs/>
-          <w:sz w:val="22"/>
-          <w:szCs w:val="22"/>
-          <w:lang w:val="en-GB"/>
-        </w:rPr>
-        <w:t>Discussion</w:t>
-      </w:r>
-    </w:p>
-    <w:p>
-      <w:pPr>
         <w:pStyle w:val="ListParagraph"/>
         <w:numPr>
           <w:ilvl w:val="0"/>
@@ -18315,7 +18417,67 @@
           <w:szCs w:val="22"/>
           <w:lang w:val="en-GB"/>
         </w:rPr>
-        <w:t>Where do proxy and model outcomes agree or disagree?</w:t>
+        <w:lastRenderedPageBreak/>
+        <w:t>Assembling measurements as priors instead of model priors for SSS and/or SST</w:t>
+      </w:r>
+    </w:p>
+    <w:p>
+      <w:pPr>
+        <w:jc w:val="both"/>
+        <w:rPr>
+          <w:sz w:val="22"/>
+          <w:szCs w:val="22"/>
+          <w:lang w:val="en-GB"/>
+        </w:rPr>
+      </w:pPr>
+      <w:r>
+        <w:rPr>
+          <w:noProof/>
+          <w:sz w:val="22"/>
+          <w:szCs w:val="22"/>
+          <w:lang w:val="en-GB"/>
+        </w:rPr>
+        <w:drawing>
+          <wp:inline distT="0" distB="0" distL="0" distR="0" wp14:anchorId="070D73C1" wp14:editId="2D26C726">
+            <wp:extent cx="5731510" cy="2853690"/>
+            <wp:effectExtent l="0" t="0" r="2540" b="3810"/>
+            <wp:docPr id="1124330304" name="Picture 1"/>
+            <wp:cNvGraphicFramePr>
+              <a:graphicFrameLocks xmlns:a="http://schemas.openxmlformats.org/drawingml/2006/main" noChangeAspect="1"/>
+            </wp:cNvGraphicFramePr>
+            <a:graphic xmlns:a="http://schemas.openxmlformats.org/drawingml/2006/main">
+              <a:graphicData uri="http://schemas.openxmlformats.org/drawingml/2006/picture">
+                <pic:pic xmlns:pic="http://schemas.openxmlformats.org/drawingml/2006/picture">
+                  <pic:nvPicPr>
+                    <pic:cNvPr id="1124330304" name="Picture 1124330304"/>
+                    <pic:cNvPicPr/>
+                  </pic:nvPicPr>
+                  <pic:blipFill>
+                    <a:blip r:embed="rId22">
+                      <a:extLst>
+                        <a:ext uri="{28A0092B-C50C-407E-A947-70E740481C1C}">
+                          <a14:useLocalDpi xmlns:a14="http://schemas.microsoft.com/office/drawing/2010/main" val="0"/>
+                        </a:ext>
+                      </a:extLst>
+                    </a:blip>
+                    <a:stretch>
+                      <a:fillRect/>
+                    </a:stretch>
+                  </pic:blipFill>
+                  <pic:spPr>
+                    <a:xfrm>
+                      <a:off x="0" y="0"/>
+                      <a:ext cx="5731510" cy="2853690"/>
+                    </a:xfrm>
+                    <a:prstGeom prst="rect">
+                      <a:avLst/>
+                    </a:prstGeom>
+                  </pic:spPr>
+                </pic:pic>
+              </a:graphicData>
+            </a:graphic>
+          </wp:inline>
+        </w:drawing>
       </w:r>
     </w:p>
     <w:p>
@@ -18332,13 +18494,27 @@
           <w:lang w:val="en-GB"/>
         </w:rPr>
       </w:pPr>
-      <w:r>
-        <w:rPr>
-          <w:sz w:val="22"/>
-          <w:szCs w:val="22"/>
-          <w:lang w:val="en-GB"/>
-        </w:rPr>
-        <w:t>Quality of proxy data and transfer functions vs bias in models?</w:t>
+    </w:p>
+    <w:p>
+      <w:pPr>
+        <w:jc w:val="both"/>
+        <w:rPr>
+          <w:b/>
+          <w:bCs/>
+          <w:sz w:val="22"/>
+          <w:szCs w:val="22"/>
+          <w:lang w:val="en-GB"/>
+        </w:rPr>
+      </w:pPr>
+      <w:r>
+        <w:rPr>
+          <w:b/>
+          <w:bCs/>
+          <w:sz w:val="22"/>
+          <w:szCs w:val="22"/>
+          <w:lang w:val="en-GB"/>
+        </w:rPr>
+        <w:t>Discussion</w:t>
       </w:r>
     </w:p>
     <w:p>
@@ -18361,7 +18537,7 @@
           <w:szCs w:val="22"/>
           <w:lang w:val="en-GB"/>
         </w:rPr>
-        <w:t>How to weigh proxy vs model information?</w:t>
+        <w:t>Where do proxy and model outcomes agree or disagree?</w:t>
       </w:r>
     </w:p>
     <w:p>
@@ -18384,7 +18560,7 @@
           <w:szCs w:val="22"/>
           <w:lang w:val="en-GB"/>
         </w:rPr>
-        <w:t>Can seasonal proxy data be used to inform or tune modelling efforts?</w:t>
+        <w:t>Quality of proxy data and transfer functions vs bias in models?</w:t>
       </w:r>
     </w:p>
     <w:p>
@@ -18407,39 +18583,7 @@
           <w:szCs w:val="22"/>
           <w:lang w:val="en-GB"/>
         </w:rPr>
-        <w:t>How powerful is DA for inferring structure of un-sampled climate parameters?</w:t>
-      </w:r>
-    </w:p>
-    <w:p>
-      <w:pPr>
-        <w:jc w:val="both"/>
-        <w:rPr>
-          <w:b/>
-          <w:bCs/>
-          <w:sz w:val="22"/>
-          <w:szCs w:val="22"/>
-          <w:lang w:val="en-GB"/>
-        </w:rPr>
-      </w:pPr>
-      <w:r>
-        <w:rPr>
-          <w:b/>
-          <w:bCs/>
-          <w:sz w:val="22"/>
-          <w:szCs w:val="22"/>
-          <w:lang w:val="en-GB"/>
-        </w:rPr>
-        <w:t>Outlook</w:t>
-      </w:r>
-      <w:r>
-        <w:rPr>
-          <w:b/>
-          <w:bCs/>
-          <w:sz w:val="22"/>
-          <w:szCs w:val="22"/>
-          <w:lang w:val="en-GB"/>
-        </w:rPr>
-        <w:t xml:space="preserve"> and recommendations</w:t>
+        <w:t>How to weigh proxy vs model information?</w:t>
       </w:r>
     </w:p>
     <w:p>
@@ -18462,7 +18606,7 @@
           <w:szCs w:val="22"/>
           <w:lang w:val="en-GB"/>
         </w:rPr>
-        <w:t>Which proxy(-forward model) improvements are the best to focus on to improve our ground-truth information for model assessment?</w:t>
+        <w:t>Can seasonal proxy data be used to inform or tune modelling efforts?</w:t>
       </w:r>
     </w:p>
     <w:p>
@@ -18485,7 +18629,39 @@
           <w:szCs w:val="22"/>
           <w:lang w:val="en-GB"/>
         </w:rPr>
-        <w:t>What model biases can be highlighted and how might they be addressed?</w:t>
+        <w:t>How powerful is DA for inferring structure of un-sampled climate parameters?</w:t>
+      </w:r>
+    </w:p>
+    <w:p>
+      <w:pPr>
+        <w:jc w:val="both"/>
+        <w:rPr>
+          <w:b/>
+          <w:bCs/>
+          <w:sz w:val="22"/>
+          <w:szCs w:val="22"/>
+          <w:lang w:val="en-GB"/>
+        </w:rPr>
+      </w:pPr>
+      <w:r>
+        <w:rPr>
+          <w:b/>
+          <w:bCs/>
+          <w:sz w:val="22"/>
+          <w:szCs w:val="22"/>
+          <w:lang w:val="en-GB"/>
+        </w:rPr>
+        <w:t>Outlook</w:t>
+      </w:r>
+      <w:r>
+        <w:rPr>
+          <w:b/>
+          <w:bCs/>
+          <w:sz w:val="22"/>
+          <w:szCs w:val="22"/>
+          <w:lang w:val="en-GB"/>
+        </w:rPr>
+        <w:t xml:space="preserve"> and recommendations</w:t>
       </w:r>
     </w:p>
     <w:p>
@@ -18508,27 +18684,73 @@
           <w:szCs w:val="22"/>
           <w:lang w:val="en-GB"/>
         </w:rPr>
-        <w:t xml:space="preserve">Any technical improvements in the DA script needed to better </w:t>
-      </w:r>
-      <w:r>
-        <w:rPr>
-          <w:sz w:val="22"/>
-          <w:szCs w:val="22"/>
-          <w:lang w:val="en-GB"/>
-        </w:rPr>
-        <w:t>assimilate</w:t>
-      </w:r>
-      <w:r>
-        <w:rPr>
-          <w:sz w:val="22"/>
-          <w:szCs w:val="22"/>
-          <w:lang w:val="en-GB"/>
-        </w:rPr>
-        <w:t xml:space="preserve"> these data types?</w:t>
+        <w:t>Which proxy(-forward model) improvements are the best to focus on to improve our ground-truth information for model assessment?</w:t>
       </w:r>
     </w:p>
     <w:p>
       <w:pPr>
+        <w:pStyle w:val="ListParagraph"/>
+        <w:numPr>
+          <w:ilvl w:val="0"/>
+          <w:numId w:val="1"/>
+        </w:numPr>
+        <w:jc w:val="both"/>
+        <w:rPr>
+          <w:sz w:val="22"/>
+          <w:szCs w:val="22"/>
+          <w:lang w:val="en-GB"/>
+        </w:rPr>
+      </w:pPr>
+      <w:r>
+        <w:rPr>
+          <w:sz w:val="22"/>
+          <w:szCs w:val="22"/>
+          <w:lang w:val="en-GB"/>
+        </w:rPr>
+        <w:t>What model biases can be highlighted and how might they be addressed?</w:t>
+      </w:r>
+    </w:p>
+    <w:p>
+      <w:pPr>
+        <w:pStyle w:val="ListParagraph"/>
+        <w:numPr>
+          <w:ilvl w:val="0"/>
+          <w:numId w:val="1"/>
+        </w:numPr>
+        <w:jc w:val="both"/>
+        <w:rPr>
+          <w:sz w:val="22"/>
+          <w:szCs w:val="22"/>
+          <w:lang w:val="en-GB"/>
+        </w:rPr>
+      </w:pPr>
+      <w:r>
+        <w:rPr>
+          <w:sz w:val="22"/>
+          <w:szCs w:val="22"/>
+          <w:lang w:val="en-GB"/>
+        </w:rPr>
+        <w:t xml:space="preserve">Any technical improvements in the DA script needed to better </w:t>
+      </w:r>
+      <w:r>
+        <w:rPr>
+          <w:sz w:val="22"/>
+          <w:szCs w:val="22"/>
+          <w:lang w:val="en-GB"/>
+        </w:rPr>
+        <w:t>assimilate</w:t>
+      </w:r>
+      <w:r>
+        <w:rPr>
+          <w:sz w:val="22"/>
+          <w:szCs w:val="22"/>
+          <w:lang w:val="en-GB"/>
+        </w:rPr>
+        <w:t xml:space="preserve"> these data types?</w:t>
+      </w:r>
+    </w:p>
+    <w:p>
+      <w:pPr>
         <w:jc w:val="both"/>
         <w:rPr>
           <w:b/>
@@ -18572,11 +18794,7 @@
         <w:fldChar w:fldCharType="separate"/>
       </w:r>
       <w:r>
-        <w:t xml:space="preserve">Alberti, M., Fürsich, F. T., Abdelhady, A. A., and Andersen, N.: Middle to Late Jurassic equatorial seawater temperatures and latitudinal temperature gradients based on stable isotopes of brachiopods and oysters from Gebel Maghara, Egypt, </w:t>
-      </w:r>
-      <w:r>
-        <w:lastRenderedPageBreak/>
-        <w:t>Palaeogeography, Palaeoclimatology, Palaeoecology, 468, 301–313, https://doi.org/10.1016/j.palaeo.2016.11.052, 2017.</w:t>
+        <w:t>Alberti, M., Fürsich, F. T., Abdelhady, A. A., and Andersen, N.: Middle to Late Jurassic equatorial seawater temperatures and latitudinal temperature gradients based on stable isotopes of brachiopods and oysters from Gebel Maghara, Egypt, Palaeogeography, Palaeoclimatology, Palaeoecology, 468, 301–313, https://doi.org/10.1016/j.palaeo.2016.11.052, 2017.</w:t>
       </w:r>
     </w:p>
     <w:p>
@@ -18592,7 +18810,11 @@
         <w:pStyle w:val="Bibliography"/>
       </w:pPr>
       <w:r>
-        <w:t>Baatsen, M., von der Heydt, A. S., Huber, M., Kliphuis, M. A., Bijl, P. K., Sluijs, A., and Dijkstra, H. A.: The middle to late Eocene greenhouse climate modelled using the CESM 1.0.5, Climate of the Past, 16, 2573–2597, https://doi.org/10.5194/cp-16-2573-2020, 2020.</w:t>
+        <w:t xml:space="preserve">Baatsen, M., von der Heydt, A. S., Huber, M., Kliphuis, M. A., Bijl, P. K., Sluijs, A., and Dijkstra, H. A.: The middle to late Eocene greenhouse climate modelled using the CESM </w:t>
+      </w:r>
+      <w:r>
+        <w:lastRenderedPageBreak/>
+        <w:t>1.0.5, Climate of the Past, 16, 2573–2597, https://doi.org/10.5194/cp-16-2573-2020, 2020.</w:t>
       </w:r>
     </w:p>
     <w:p>
@@ -18664,11 +18886,7 @@
         <w:pStyle w:val="Bibliography"/>
       </w:pPr>
       <w:r>
-        <w:t xml:space="preserve">Danabasoglu, G., Lamarque, J.-F., Bacmeister, J., Bailey, D. A., DuVivier, A. K., Edwards, J., Emmons, L. K., Fasullo, J., Garcia, R., Gettelman, A., Hannay, C., Holland, M. M., </w:t>
-      </w:r>
-      <w:r>
-        <w:lastRenderedPageBreak/>
-        <w:t>Large, W. G., Lauritzen, P. H., Lawrence, D. M., Lenaerts, J. T. M., Lindsay, K., Lipscomb, W. H., Mills, M. J., Neale, R., Oleson, K. W., Otto-Bliesner, B., Phillips, A. S., Sacks, W., Tilmes, S., van Kampenhout, L., Vertenstein, M., Bertini, A., Dennis, J., Deser, C., Fischer, C., Fox-Kemper, B., Kay, J. E., Kinnison, D., Kushner, P. J., Larson, V. E., Long, M. C., Mickelson, S., Moore, J. K., Nienhouse, E., Polvani, L., Rasch, P. J., and Strand, W. G.: The Community Earth System Model Version 2 (CESM2), Journal of Advances in Modeling Earth Systems, 12, e2019MS001916, https://doi.org/10.1029/2019MS001916, 2020.</w:t>
+        <w:t>Danabasoglu, G., Lamarque, J.-F., Bacmeister, J., Bailey, D. A., DuVivier, A. K., Edwards, J., Emmons, L. K., Fasullo, J., Garcia, R., Gettelman, A., Hannay, C., Holland, M. M., Large, W. G., Lauritzen, P. H., Lawrence, D. M., Lenaerts, J. T. M., Lindsay, K., Lipscomb, W. H., Mills, M. J., Neale, R., Oleson, K. W., Otto-Bliesner, B., Phillips, A. S., Sacks, W., Tilmes, S., van Kampenhout, L., Vertenstein, M., Bertini, A., Dennis, J., Deser, C., Fischer, C., Fox-Kemper, B., Kay, J. E., Kinnison, D., Kushner, P. J., Larson, V. E., Long, M. C., Mickelson, S., Moore, J. K., Nienhouse, E., Polvani, L., Rasch, P. J., and Strand, W. G.: The Community Earth System Model Version 2 (CESM2), Journal of Advances in Modeling Earth Systems, 12, e2019MS001916, https://doi.org/10.1029/2019MS001916, 2020.</w:t>
       </w:r>
     </w:p>
     <w:p>
@@ -18676,6 +18894,7 @@
         <w:pStyle w:val="Bibliography"/>
       </w:pPr>
       <w:r>
+        <w:lastRenderedPageBreak/>
         <w:t>De Winter, N., Snoeck, C., and Claeys, P.: Seasonal cyclicity in trace elements and stable isotopes of modern horse enamel, PLoS ONE, 11, 1, https://doi.org/10.1371/journal.pone.0166678, 2016.</w:t>
       </w:r>
     </w:p>
@@ -18740,7 +18959,6 @@
         <w:pStyle w:val="Bibliography"/>
       </w:pPr>
       <w:r>
-        <w:lastRenderedPageBreak/>
         <w:t>Gagan, M. K., Chivas, A. R., and Isdale, P. J.: High-resolution isotopic records from corals using ocean temperature and mass-spawning chronometers, Earth and Planetary Science Letters, 121, 549–558, https://doi.org/10.1016/0012-821X(94)90090-6, 1994.</w:t>
       </w:r>
     </w:p>
@@ -18757,6 +18975,7 @@
         <w:pStyle w:val="Bibliography"/>
       </w:pPr>
       <w:r>
+        <w:lastRenderedPageBreak/>
         <w:t>Gély, J. P. and Merle, D.: La stratigraphie et la paléogéographie du Lutétien en France, Stratotype Lutétien. Muséum National d’Histoire Naturelle, Paris, 182–227, 2008.</w:t>
       </w:r>
     </w:p>
@@ -18839,7 +19058,6 @@
         <w:pStyle w:val="Bibliography"/>
       </w:pPr>
       <w:r>
-        <w:lastRenderedPageBreak/>
         <w:t>Haywood, A. M., Dowsett, H. J., Dolan, A. M., Rowley, D., Abe-Ouchi, A., Otto-Bliesner, B., Chandler, M. A., Hunter, S. J., Lunt, D. J., Pound, M., and Salzmann, U.: The Pliocene Model Intercomparison Project (PlioMIP) Phase 2: scientific objectives and experimental design, Climate of the Past, 12, 663–675, https://doi.org/10.5194/cp-12-663-2016, 2016.</w:t>
       </w:r>
     </w:p>
@@ -18856,6 +19074,7 @@
         <w:pStyle w:val="Bibliography"/>
       </w:pPr>
       <w:r>
+        <w:lastRenderedPageBreak/>
         <w:t>Henkes, G. A., Passey, B. H., Grossman, E. L., Shenton, B. J., Yancey, T. E., and Pérez-Huerta, A.: Temperature evolution and the oxygen isotope composition of Phanerozoic oceans from carbonate clumped isotope thermometry, Earth and Planetary Science Letters, 490, 40–50, https://doi.org/10.1016/j.epsl.2018.02.001, 2018.</w:t>
       </w:r>
     </w:p>
@@ -18920,7 +19139,6 @@
         <w:pStyle w:val="Bibliography"/>
       </w:pPr>
       <w:r>
-        <w:lastRenderedPageBreak/>
         <w:t>Judd, E. J., Bhattacharya, T., and Ivany, L. C.: A Dynamical Framework for Interpreting Ancient Sea Surface Temperatures, Geophysical Research Letters, 47, e2020GL089044, https://doi.org/10.1029/2020GL089044, 2020.</w:t>
       </w:r>
     </w:p>
@@ -18945,6 +19163,7 @@
         <w:pStyle w:val="Bibliography"/>
       </w:pPr>
       <w:r>
+        <w:lastRenderedPageBreak/>
         <w:t>Kim, S.-T., O’Neil, J. R., Hillaire-Marcel, C., and Mucci, A.: Oxygen isotope fractionation between synthetic aragonite and water: Influence of temperature and Mg2+ concentration, Geochimica et Cosmochimica Acta, 71, 4704–4715, https://doi.org/10.1016/j.gca.2007.04.019, 2007.</w:t>
       </w:r>
     </w:p>
@@ -19001,11 +19220,7 @@
         <w:pStyle w:val="Bibliography"/>
       </w:pPr>
       <w:r>
-        <w:t xml:space="preserve">Locarnini, R. A., Mishonov, A. V., Antonov, J. I., Boyer, T. P., Garcia, H. E., Baranova, O. K., Zweng, M. M., Paver, C. R., Reagan, J. R., Johnson, D. R., Hamilton, M., and Seidov, D.: World ocean atlas 2013. Volume 1, Temperature, U.S. Department of Commerce, </w:t>
-      </w:r>
-      <w:r>
-        <w:lastRenderedPageBreak/>
-        <w:t>National Oceanic and Atmospheric Administration, National Environmental Satellite, Data and Information Service, https://doi.org/10.7289/v55x26vd, 2013.</w:t>
+        <w:t>Locarnini, R. A., Mishonov, A. V., Antonov, J. I., Boyer, T. P., Garcia, H. E., Baranova, O. K., Zweng, M. M., Paver, C. R., Reagan, J. R., Johnson, D. R., Hamilton, M., and Seidov, D.: World ocean atlas 2013. Volume 1, Temperature, U.S. Department of Commerce, National Oceanic and Atmospheric Administration, National Environmental Satellite, Data and Information Service, https://doi.org/10.7289/v55x26vd, 2013.</w:t>
       </w:r>
     </w:p>
     <w:p>
@@ -19029,6 +19244,7 @@
         <w:pStyle w:val="Bibliography"/>
       </w:pPr>
       <w:r>
+        <w:lastRenderedPageBreak/>
         <w:t>McCulloch, M. T., Winter, A., Sherman, C. E., and Trotter, J. A.: 300 years of sclerosponge thermometry shows global warming has exceeded 1.5 °C, Nat. Clim. Chang., 14, 171–177, https://doi.org/10.1038/s41558-023-01919-7, 2024.</w:t>
       </w:r>
     </w:p>
@@ -19077,11 +19293,7 @@
         <w:pStyle w:val="Bibliography"/>
       </w:pPr>
       <w:r>
-        <w:t xml:space="preserve">Petersen, S. V., Defliese, W. F., Saenger, C., Daëron, M., Huntington, K. W., John, C. M., Kelson, J. R., Bernasconi, S. M., Colman, A. S., Kluge, T., Olack, G. A., Schauer, A. J., Bajnai, D., Bonifacie, M., Breitenbach, S. F. M., Fiebig, J., Fernandez, A. B., Henkes, G. A., Hodell, D., Katz, A., Kele, S., Lohmann, K. C., Passey, B. H., Peral, M. Y., Petrizzo, D. A., Rosenheim, B. E., Tripati, A., Venturelli, R., Young, E. D., and Winkelstern, I. Z.: Effects of Improved 17O Correction on Interlaboratory Agreement in Clumped Isotope Calibrations, Estimates of Mineral-Specific Offsets, and Temperature Dependence of </w:t>
-      </w:r>
-      <w:r>
-        <w:lastRenderedPageBreak/>
-        <w:t>Acid Digestion Fractionation, Geochemistry, Geophysics, Geosystems, 20, 3495–3519, https://doi.org/10.1029/2018GC008127, 2019.</w:t>
+        <w:t>Petersen, S. V., Defliese, W. F., Saenger, C., Daëron, M., Huntington, K. W., John, C. M., Kelson, J. R., Bernasconi, S. M., Colman, A. S., Kluge, T., Olack, G. A., Schauer, A. J., Bajnai, D., Bonifacie, M., Breitenbach, S. F. M., Fiebig, J., Fernandez, A. B., Henkes, G. A., Hodell, D., Katz, A., Kele, S., Lohmann, K. C., Passey, B. H., Peral, M. Y., Petrizzo, D. A., Rosenheim, B. E., Tripati, A., Venturelli, R., Young, E. D., and Winkelstern, I. Z.: Effects of Improved 17O Correction on Interlaboratory Agreement in Clumped Isotope Calibrations, Estimates of Mineral-Specific Offsets, and Temperature Dependence of Acid Digestion Fractionation, Geochemistry, Geophysics, Geosystems, 20, 3495–3519, https://doi.org/10.1029/2018GC008127, 2019.</w:t>
       </w:r>
     </w:p>
     <w:p>
@@ -19113,6 +19325,7 @@
         <w:pStyle w:val="Bibliography"/>
       </w:pPr>
       <w:r>
+        <w:lastRenderedPageBreak/>
         <w:t>Reagan, J. R., Seidov, D., Wang, Z., Dukhovskoy, D., Boyer, T. P., Locarnini, R. A., Baranova, O. K., Mishonov, A. V., Garcia, H. E., and Bouchard, C.: World ocean atlas 2023, volume 2: salinity, 2024.</w:t>
       </w:r>
     </w:p>
@@ -19169,7 +19382,6 @@
         <w:pStyle w:val="Bibliography"/>
       </w:pPr>
       <w:r>
-        <w:lastRenderedPageBreak/>
         <w:t>Van Horebeek, N., de Winter, N. J., Baatsen, M., Ziegler, M., Speijer, R. P., and Vellekoop, J.: A European monsoon-like climate in a warmhouse world, Nat Commun, 16, 9207, https://doi.org/10.1038/s41467-025-64241-0, 2025.</w:t>
       </w:r>
     </w:p>
@@ -19186,7 +19398,11 @@
         <w:pStyle w:val="Bibliography"/>
       </w:pPr>
       <w:r>
-        <w:t>Van Rampelbergh, M., Verheyden, S., Allan, M., Quinif, Y., Keppens, E., and Claeys, P.: Seasonal variations recorded in cave monitoring results and a 10 year monthly resolved speleothem &amp;amp;delta;&amp;lt;sup&amp;gt;18&amp;lt;/sup&amp;gt;O and &amp;amp;delta;&amp;lt;sup&amp;gt;13&amp;lt;/sup&amp;gt;C record from the Han-sur-Lesse cave, Belgium, Climate of the Past Discussions, 10, 1821–1856, https://doi.org/10.5194/cpd-10-1821-2014, 2014b.</w:t>
+        <w:t xml:space="preserve">Van Rampelbergh, M., Verheyden, S., Allan, M., Quinif, Y., Keppens, E., and Claeys, P.: Seasonal variations recorded in cave monitoring results and a 10 year monthly resolved speleothem &amp;amp;delta;&amp;lt;sup&amp;gt;18&amp;lt;/sup&amp;gt;O and &amp;amp;delta;&amp;lt;sup&amp;gt;13&amp;lt;/sup&amp;gt;C record from the Han-sur-Lesse cave, Belgium, </w:t>
+      </w:r>
+      <w:r>
+        <w:lastRenderedPageBreak/>
+        <w:t>Climate of the Past Discussions, 10, 1821–1856, https://doi.org/10.5194/cpd-10-1821-2014, 2014b.</w:t>
       </w:r>
     </w:p>
     <w:p>
@@ -19242,11 +19458,7 @@
         <w:pStyle w:val="Bibliography"/>
       </w:pPr>
       <w:r>
-        <w:t xml:space="preserve">de Winter, N. J., Goderis, S., Malderen, S. J. M. V., Sinnesael, M., Vansteenberge, S., Snoeck, C., Belza, J., Vanhaecke, F., and Claeys, P.: Subdaily-Scale Chemical Variability </w:t>
-      </w:r>
-      <w:r>
-        <w:lastRenderedPageBreak/>
-        <w:t>in a Torreites Sanchezi Rudist Shell: Implications for Rudist Paleobiology and the Cretaceous Day-Night Cycle, Paleoceanography and Paleoclimatology, 35, e2019PA003723, https://doi.org/10.1029/2019PA003723, 2020a.</w:t>
+        <w:t>de Winter, N. J., Goderis, S., Malderen, S. J. M. V., Sinnesael, M., Vansteenberge, S., Snoeck, C., Belza, J., Vanhaecke, F., and Claeys, P.: Subdaily-Scale Chemical Variability in a Torreites Sanchezi Rudist Shell: Implications for Rudist Paleobiology and the Cretaceous Day-Night Cycle, Paleoceanography and Paleoclimatology, 35, e2019PA003723, https://doi.org/10.1029/2019PA003723, 2020a.</w:t>
       </w:r>
     </w:p>
     <w:p>
@@ -19270,6 +19482,7 @@
         <w:pStyle w:val="Bibliography"/>
       </w:pPr>
       <w:r>
+        <w:lastRenderedPageBreak/>
         <w:t>de Winter, N. J., Witbaard, R., Kocken, I. J., Müller, I. A., Guo, J., Goudsmit, B., and Ziegler, M.: Temperature Dependence of Clumped Isotopes (∆47) in Aragonite, Geophysical Research Letters, 49, e2022GL099479, https://doi.org/10.1029/2022GL099479, 2022.</w:t>
       </w:r>
     </w:p>

</xml_diff>

<commit_message>
Expanded SSS-d18Ow sensitivity plot and updated Results section in paper
</commit_message>
<xml_diff>
--- a/MS/Seasonal_DA_MS_v1.docx
+++ b/MS/Seasonal_DA_MS_v1.docx
@@ -7462,7 +7462,7 @@
         </w:rPr>
         <w:lastRenderedPageBreak/>
         <w:drawing>
-          <wp:inline distT="0" distB="0" distL="0" distR="0" wp14:anchorId="5FC595C7" wp14:editId="0636E839">
+          <wp:inline distT="0" distB="0" distL="0" distR="0" wp14:anchorId="5FC595C7" wp14:editId="58AA0044">
             <wp:extent cx="5074930" cy="7239015"/>
             <wp:effectExtent l="0" t="0" r="0" b="0"/>
             <wp:docPr id="1465227967" name="Picture 1" descr="A diagram of a scientific experiment&#10;&#10;AI-generated content may be incorrect."/>
@@ -17993,9 +17993,9 @@
           <w:lang w:val="en-GB"/>
         </w:rPr>
         <w:drawing>
-          <wp:inline distT="0" distB="0" distL="0" distR="0" wp14:anchorId="7CC918F6" wp14:editId="6324FD55">
-            <wp:extent cx="5731510" cy="2868652"/>
-            <wp:effectExtent l="0" t="0" r="2540" b="8255"/>
+          <wp:inline distT="0" distB="0" distL="0" distR="0" wp14:anchorId="7CC918F6" wp14:editId="359AE825">
+            <wp:extent cx="5731510" cy="5363590"/>
+            <wp:effectExtent l="0" t="0" r="2540" b="8890"/>
             <wp:docPr id="1232772347" name="Picture 2"/>
             <wp:cNvGraphicFramePr>
               <a:graphicFrameLocks xmlns:a="http://schemas.openxmlformats.org/drawingml/2006/main" noChangeAspect="1"/>
@@ -18022,7 +18022,7 @@
                   <pic:spPr>
                     <a:xfrm>
                       <a:off x="0" y="0"/>
-                      <a:ext cx="5731510" cy="2868652"/>
+                      <a:ext cx="5746184" cy="5377322"/>
                     </a:xfrm>
                     <a:prstGeom prst="rect">
                       <a:avLst/>
@@ -18494,6 +18494,73 @@
           <w:lang w:val="en-GB"/>
         </w:rPr>
       </w:pPr>
+      <w:r>
+        <w:rPr>
+          <w:sz w:val="22"/>
+          <w:szCs w:val="22"/>
+          <w:lang w:val="en-GB"/>
+        </w:rPr>
+        <w:t>Sensitivity to pre-normalizing climate variables</w:t>
+      </w:r>
+    </w:p>
+    <w:p>
+      <w:pPr>
+        <w:jc w:val="both"/>
+        <w:rPr>
+          <w:sz w:val="22"/>
+          <w:szCs w:val="22"/>
+          <w:lang w:val="en-GB"/>
+        </w:rPr>
+      </w:pPr>
+      <w:r>
+        <w:rPr>
+          <w:noProof/>
+          <w:sz w:val="22"/>
+          <w:szCs w:val="22"/>
+          <w:lang w:val="en-GB"/>
+        </w:rPr>
+        <w:drawing>
+          <wp:inline distT="0" distB="0" distL="0" distR="0" wp14:anchorId="6ACCB1A4" wp14:editId="3A7C6A08">
+            <wp:extent cx="5731510" cy="2858770"/>
+            <wp:effectExtent l="0" t="0" r="2540" b="0"/>
+            <wp:docPr id="1884070988" name="Picture 1"/>
+            <wp:cNvGraphicFramePr>
+              <a:graphicFrameLocks xmlns:a="http://schemas.openxmlformats.org/drawingml/2006/main" noChangeAspect="1"/>
+            </wp:cNvGraphicFramePr>
+            <a:graphic xmlns:a="http://schemas.openxmlformats.org/drawingml/2006/main">
+              <a:graphicData uri="http://schemas.openxmlformats.org/drawingml/2006/picture">
+                <pic:pic xmlns:pic="http://schemas.openxmlformats.org/drawingml/2006/picture">
+                  <pic:nvPicPr>
+                    <pic:cNvPr id="1884070988" name="Picture 1884070988"/>
+                    <pic:cNvPicPr/>
+                  </pic:nvPicPr>
+                  <pic:blipFill>
+                    <a:blip r:embed="rId23">
+                      <a:extLst>
+                        <a:ext uri="{28A0092B-C50C-407E-A947-70E740481C1C}">
+                          <a14:useLocalDpi xmlns:a14="http://schemas.microsoft.com/office/drawing/2010/main" val="0"/>
+                        </a:ext>
+                      </a:extLst>
+                    </a:blip>
+                    <a:stretch>
+                      <a:fillRect/>
+                    </a:stretch>
+                  </pic:blipFill>
+                  <pic:spPr>
+                    <a:xfrm>
+                      <a:off x="0" y="0"/>
+                      <a:ext cx="5731510" cy="2858770"/>
+                    </a:xfrm>
+                    <a:prstGeom prst="rect">
+                      <a:avLst/>
+                    </a:prstGeom>
+                  </pic:spPr>
+                </pic:pic>
+              </a:graphicData>
+            </a:graphic>
+          </wp:inline>
+        </w:drawing>
+      </w:r>
     </w:p>
     <w:p>
       <w:pPr>
@@ -18730,6 +18797,7 @@
           <w:szCs w:val="22"/>
           <w:lang w:val="en-GB"/>
         </w:rPr>
+        <w:lastRenderedPageBreak/>
         <w:t xml:space="preserve">Any technical improvements in the DA script needed to better </w:t>
       </w:r>
       <w:r>
@@ -18810,11 +18878,7 @@
         <w:pStyle w:val="Bibliography"/>
       </w:pPr>
       <w:r>
-        <w:t xml:space="preserve">Baatsen, M., von der Heydt, A. S., Huber, M., Kliphuis, M. A., Bijl, P. K., Sluijs, A., and Dijkstra, H. A.: The middle to late Eocene greenhouse climate modelled using the CESM </w:t>
-      </w:r>
-      <w:r>
-        <w:lastRenderedPageBreak/>
-        <w:t>1.0.5, Climate of the Past, 16, 2573–2597, https://doi.org/10.5194/cp-16-2573-2020, 2020.</w:t>
+        <w:t>Baatsen, M., von der Heydt, A. S., Huber, M., Kliphuis, M. A., Bijl, P. K., Sluijs, A., and Dijkstra, H. A.: The middle to late Eocene greenhouse climate modelled using the CESM 1.0.5, Climate of the Past, 16, 2573–2597, https://doi.org/10.5194/cp-16-2573-2020, 2020.</w:t>
       </w:r>
     </w:p>
     <w:p>
@@ -18878,6 +18942,7 @@
         <w:pStyle w:val="Bibliography"/>
       </w:pPr>
       <w:r>
+        <w:lastRenderedPageBreak/>
         <w:t>Daëron, M. and Vermeesch, P.: Omnivariant generalized least squares regression: Theory, geochronological applications, and making the case for reconciled Δ47 calibrations, Chemical Geology, 121881, https://doi.org/10.1016/j.chemgeo.2023.121881, 2023.</w:t>
       </w:r>
     </w:p>
@@ -18894,7 +18959,6 @@
         <w:pStyle w:val="Bibliography"/>
       </w:pPr>
       <w:r>
-        <w:lastRenderedPageBreak/>
         <w:t>De Winter, N., Snoeck, C., and Claeys, P.: Seasonal cyclicity in trace elements and stable isotopes of modern horse enamel, PLoS ONE, 11, 1, https://doi.org/10.1371/journal.pone.0166678, 2016.</w:t>
       </w:r>
     </w:p>
@@ -18943,6 +19007,7 @@
         <w:pStyle w:val="Bibliography"/>
       </w:pPr>
       <w:r>
+        <w:lastRenderedPageBreak/>
         <w:t>Franke, J., Brönnimann, S., Bhend, J., and Brugnara, Y.: A monthly global paleo-reanalysis of the atmosphere from 1600 to 2005 for studying past climatic variations, Sci Data, 4, 170076, https://doi.org/10.1038/sdata.2017.76, 2017.</w:t>
       </w:r>
     </w:p>
@@ -18975,7 +19040,6 @@
         <w:pStyle w:val="Bibliography"/>
       </w:pPr>
       <w:r>
-        <w:lastRenderedPageBreak/>
         <w:t>Gély, J. P. and Merle, D.: La stratigraphie et la paléogéographie du Lutétien en France, Stratotype Lutétien. Muséum National d’Histoire Naturelle, Paris, 182–227, 2008.</w:t>
       </w:r>
     </w:p>
@@ -19042,6 +19106,7 @@
         <w:pStyle w:val="Bibliography"/>
       </w:pPr>
       <w:r>
+        <w:lastRenderedPageBreak/>
         <w:t>Hao, S., Zhang, X., Duan, Y., Gowan, E. J., Zhu, J., Cauquoin, A., Chen, J., Werner, M., and Chen, F.: Model seasonal and proxy spatial biases revealed by assimilated mid-Holocene seasonal temperatures, Science Bulletin, 70, 2014–2022, https://doi.org/10.1016/j.scib.2025.03.039, 2025.</w:t>
       </w:r>
     </w:p>
@@ -19074,7 +19139,6 @@
         <w:pStyle w:val="Bibliography"/>
       </w:pPr>
       <w:r>
-        <w:lastRenderedPageBreak/>
         <w:t>Henkes, G. A., Passey, B. H., Grossman, E. L., Shenton, B. J., Yancey, T. E., and Pérez-Huerta, A.: Temperature evolution and the oxygen isotope composition of Phanerozoic oceans from carbonate clumped isotope thermometry, Earth and Planetary Science Letters, 490, 40–50, https://doi.org/10.1016/j.epsl.2018.02.001, 2018.</w:t>
       </w:r>
     </w:p>
@@ -19123,6 +19187,7 @@
         <w:pStyle w:val="Bibliography"/>
       </w:pPr>
       <w:r>
+        <w:lastRenderedPageBreak/>
         <w:t>Ivany, L. C. and Judd, E. J.: Deciphering Temperature Seasonality in Earth’s Ancient Oceans, Annual Review of Earth and Planetary Sciences, 50, 123–152, https://doi.org/10.1146/annurev-earth-032320-095156, 2022.</w:t>
       </w:r>
     </w:p>
@@ -19163,7 +19228,6 @@
         <w:pStyle w:val="Bibliography"/>
       </w:pPr>
       <w:r>
-        <w:lastRenderedPageBreak/>
         <w:t>Kim, S.-T., O’Neil, J. R., Hillaire-Marcel, C., and Mucci, A.: Oxygen isotope fractionation between synthetic aragonite and water: Influence of temperature and Mg2+ concentration, Geochimica et Cosmochimica Acta, 71, 4704–4715, https://doi.org/10.1016/j.gca.2007.04.019, 2007.</w:t>
       </w:r>
     </w:p>
@@ -19212,6 +19276,7 @@
         <w:pStyle w:val="Bibliography"/>
       </w:pPr>
       <w:r>
+        <w:lastRenderedPageBreak/>
         <w:t>Liu, Z., Zhu, J., Rosenthal, Y., Zhang, X., Otto-Bliesner, B. L., Timmermann, A., Smith, R. S., Lohmann, G., Zheng, W., and Elison Timm, O.: The Holocene temperature conundrum, Proceedings of the National Academy of Sciences, 111, E3501–E3505, https://doi.org/10.1073/pnas.1407229111, 2014.</w:t>
       </w:r>
     </w:p>
@@ -19244,7 +19309,6 @@
         <w:pStyle w:val="Bibliography"/>
       </w:pPr>
       <w:r>
-        <w:lastRenderedPageBreak/>
         <w:t>McCulloch, M. T., Winter, A., Sherman, C. E., and Trotter, J. A.: 300 years of sclerosponge thermometry shows global warming has exceeded 1.5 °C, Nat. Clim. Chang., 14, 171–177, https://doi.org/10.1038/s41558-023-01919-7, 2024.</w:t>
       </w:r>
     </w:p>
@@ -19293,6 +19357,7 @@
         <w:pStyle w:val="Bibliography"/>
       </w:pPr>
       <w:r>
+        <w:lastRenderedPageBreak/>
         <w:t>Petersen, S. V., Defliese, W. F., Saenger, C., Daëron, M., Huntington, K. W., John, C. M., Kelson, J. R., Bernasconi, S. M., Colman, A. S., Kluge, T., Olack, G. A., Schauer, A. J., Bajnai, D., Bonifacie, M., Breitenbach, S. F. M., Fiebig, J., Fernandez, A. B., Henkes, G. A., Hodell, D., Katz, A., Kele, S., Lohmann, K. C., Passey, B. H., Peral, M. Y., Petrizzo, D. A., Rosenheim, B. E., Tripati, A., Venturelli, R., Young, E. D., and Winkelstern, I. Z.: Effects of Improved 17O Correction on Interlaboratory Agreement in Clumped Isotope Calibrations, Estimates of Mineral-Specific Offsets, and Temperature Dependence of Acid Digestion Fractionation, Geochemistry, Geophysics, Geosystems, 20, 3495–3519, https://doi.org/10.1029/2018GC008127, 2019.</w:t>
       </w:r>
     </w:p>
@@ -19325,7 +19390,6 @@
         <w:pStyle w:val="Bibliography"/>
       </w:pPr>
       <w:r>
-        <w:lastRenderedPageBreak/>
         <w:t>Reagan, J. R., Seidov, D., Wang, Z., Dukhovskoy, D., Boyer, T. P., Locarnini, R. A., Baranova, O. K., Mishonov, A. V., Garcia, H. E., and Bouchard, C.: World ocean atlas 2023, volume 2: salinity, 2024.</w:t>
       </w:r>
     </w:p>
@@ -19374,6 +19438,7 @@
         <w:pStyle w:val="Bibliography"/>
       </w:pPr>
       <w:r>
+        <w:lastRenderedPageBreak/>
         <w:t>Tierney, J. E., Judd, E. J., Osman, M. B., King, J. M., Truax, O. J., Steiger, N. J., Amrhein, D. E., and Anchukaitis, K. J.: Advances in Paleoclimate Data Assimilation, Annual Review of Earth and Planetary Sciences, 53, 625–650, https://doi.org/10.1146/annurev-earth-032320-064209, 2025.</w:t>
       </w:r>
     </w:p>
@@ -19398,11 +19463,7 @@
         <w:pStyle w:val="Bibliography"/>
       </w:pPr>
       <w:r>
-        <w:t xml:space="preserve">Van Rampelbergh, M., Verheyden, S., Allan, M., Quinif, Y., Keppens, E., and Claeys, P.: Seasonal variations recorded in cave monitoring results and a 10 year monthly resolved speleothem &amp;amp;delta;&amp;lt;sup&amp;gt;18&amp;lt;/sup&amp;gt;O and &amp;amp;delta;&amp;lt;sup&amp;gt;13&amp;lt;/sup&amp;gt;C record from the Han-sur-Lesse cave, Belgium, </w:t>
-      </w:r>
-      <w:r>
-        <w:lastRenderedPageBreak/>
-        <w:t>Climate of the Past Discussions, 10, 1821–1856, https://doi.org/10.5194/cpd-10-1821-2014, 2014b.</w:t>
+        <w:t>Van Rampelbergh, M., Verheyden, S., Allan, M., Quinif, Y., Keppens, E., and Claeys, P.: Seasonal variations recorded in cave monitoring results and a 10 year monthly resolved speleothem &amp;amp;delta;&amp;lt;sup&amp;gt;18&amp;lt;/sup&amp;gt;O and &amp;amp;delta;&amp;lt;sup&amp;gt;13&amp;lt;/sup&amp;gt;C record from the Han-sur-Lesse cave, Belgium, Climate of the Past Discussions, 10, 1821–1856, https://doi.org/10.5194/cpd-10-1821-2014, 2014b.</w:t>
       </w:r>
     </w:p>
     <w:p>
@@ -19450,7 +19511,11 @@
         <w:pStyle w:val="Bibliography"/>
       </w:pPr>
       <w:r>
-        <w:t>de Winter, N. J., Goderis, S., Dehairs, F., Jagt, J. W. M., Fraaije, R. H. B., Van Malderen, S. J. M., Vanhaecke, F., and Claeys, P.: Tropical seasonality in the late Campanian (late Cretaceous): Comparison between multiproxy records from three bivalve taxa from Oman, Palaeogeography, Palaeoclimatology, Palaeoecology, 485, 740–760, https://doi.org/10.1016/j.palaeo.2017.07.031, 2017.</w:t>
+        <w:t xml:space="preserve">de Winter, N. J., Goderis, S., Dehairs, F., Jagt, J. W. M., Fraaije, R. H. B., Van Malderen, S. J. M., Vanhaecke, F., and Claeys, P.: Tropical seasonality in the late Campanian (late Cretaceous): Comparison between multiproxy records from three bivalve taxa from </w:t>
+      </w:r>
+      <w:r>
+        <w:lastRenderedPageBreak/>
+        <w:t>Oman, Palaeogeography, Palaeoclimatology, Palaeoecology, 485, 740–760, https://doi.org/10.1016/j.palaeo.2017.07.031, 2017.</w:t>
       </w:r>
     </w:p>
     <w:p>
@@ -19482,7 +19547,6 @@
         <w:pStyle w:val="Bibliography"/>
       </w:pPr>
       <w:r>
-        <w:lastRenderedPageBreak/>
         <w:t>de Winter, N. J., Witbaard, R., Kocken, I. J., Müller, I. A., Guo, J., Goudsmit, B., and Ziegler, M.: Temperature Dependence of Clumped Isotopes (∆47) in Aragonite, Geophysical Research Letters, 49, e2022GL099479, https://doi.org/10.1029/2022GL099479, 2022.</w:t>
       </w:r>
     </w:p>

</xml_diff>